<commit_message>
Update prompts and switch LangChain LLM to GigaChat
</commit_message>
<xml_diff>
--- a/govno_model/govno_analysis.docx
+++ b/govno_model/govno_analysis.docx
@@ -4,6 +4,18 @@
   <w:body>
     <w:p>
       <w:r>
+        <w:br/>
+        <w:t>----------------------------------------------------------------------------------</w:t>
+        <w:br/>
+        <w:br/>
+        <w:t>----------------------------------------------------------------------------------</w:t>
+        <w:br/>
+        <w:br/>
+        <w:t>----------------------------------------------------------------------------------</w:t>
+        <w:br/>
+        <w:br/>
+        <w:t>----------------------------------------------------------------------------------</w:t>
+        <w:br/>
         <w:t>-------------------------</w:t>
         <w:br/>
         <w:t>-------------------------</w:t>
@@ -37,9 +49,25 @@
         <w:br/>
         <w:t>Ошибки:</w:t>
         <w:br/>
-        <w:t>- В Контракте отсутствуют коды ОКПД: 31.01.11.150, 31.01.12.110, 31.01.12.131, 31.01.12.139, 31.01.12.150</w:t>
+        <w:t>- В Контракте отсутствует ОКПД 31.01.11.150 - Мебель для сидения, преимущественно с металлическим каркасом из плана-графика.</w:t>
         <w:br/>
-        <w:t>- В ООЗ отсутствуют коды ОКПД: 31.01.11.150, 31.01.12.110, 31.01.12.131, 31.01.12.139, 31.01.12.150</w:t>
+        <w:t>- В Контракте отсутствует ОКПД 31.01.12.110 - Столы письменные деревянные для офисов, административных помещений из плана-графика.</w:t>
+        <w:br/>
+        <w:t>- В Контракте отсутствует ОКПД 31.01.12.131 - Шкафы для одежды деревянные из плана-графика.</w:t>
+        <w:br/>
+        <w:t>- В Контракте отсутствует ОКПД 31.01.12.139 - Шкафы деревянные прочие из плана-графика.</w:t>
+        <w:br/>
+        <w:t>- В Контракте отсутствует ОКПД 31.01.12.150 - Тумбы офисные деревянные из плана-графика.</w:t>
+        <w:br/>
+        <w:t>- В ООЗ отсутствует ОКПД 31.01.11.150 - Мебель для сидения, преимущественно с металлическим каркасом из плана-графика.</w:t>
+        <w:br/>
+        <w:t>- В ООЗ отсутствует ОКПД 31.01.12.110 - Столы письменные деревянные для офисов, административных помещений из плана-графика.</w:t>
+        <w:br/>
+        <w:t>- В ООЗ отсутствует ОКПД 31.01.12.131 - Шкафы для одежды деревянные из плана-графика.</w:t>
+        <w:br/>
+        <w:t>- В ООЗ отсутствует ОКПД 31.01.12.139 - Шкафы деревянные прочие из плана-графика.</w:t>
+        <w:br/>
+        <w:t>- В ООЗ отсутствует ОКПД 31.01.12.150 - Тумбы офисные деревянные из плана-графика.</w:t>
         <w:br/>
         <w:br/>
         <w:t>-------------------------</w:t>
@@ -75,9 +103,9 @@
         <w:br/>
         <w:t>Ошибки:</w:t>
         <w:br/>
-        <w:t>- В Контракте отсутствует КТРУ: 31.01.11.150-00000003 (Стул на металлическом каркасе)</w:t>
+        <w:t>- В Контракте отсутствует КТРУ 31.01.11.150-00000003 - Стул на металлическом каркасе из плана-графика.</w:t>
         <w:br/>
-        <w:t>- В ООЗ отсутствует КТРУ: 31.01.11.150-00000003 (Стул на металлическом каркасе)</w:t>
+        <w:t>- В ООЗ отсутствует КТРУ 31.01.11.150-00000003 - Стул на металлическом каркасе из плана-графика.</w:t>
         <w:br/>
         <w:br/>
         <w:t>-------------------------</w:t>
@@ -97,15 +125,15 @@
         <w:br/>
         <w:t>Найдено в Пояснительной записке:</w:t>
         <w:br/>
-        <w:t>Стол письменный - 12 шт.; Стол письменный - 1 шт.; Надставка настольная - 7 шт.; Тумба офисная деревянная - 12 шт.; Тумба офисная деревянная - 4 шт.; Тумба офисная деревянная - 3 шт.; Подставка под системный блок - 14 шт.; Кресло офисное - 7 шт.; Шкаф для одежды деревянный - 4 шт.; Шкаф для одежды деревянный - 2 шт.; Шкаф для одежды деревянный - 1 шт.; Шкаф деревянный для документов - 1 шт.; Шкаф деревянный для документов - 1 шт.; Шкаф деревянный для документов - 2 шт.; Стул на металлическом каркасе - 4 шт.</w:t>
+        <w:t>все позиции и количества совпадают</w:t>
         <w:br/>
         <w:br/>
         <w:t>-------------------------</w:t>
         <w:br/>
         <w:br/>
-        <w:t>Найдено в ОМНЦК:</w:t>
+        <w:t>Найдено в ОНМЦК:</w:t>
         <w:br/>
-        <w:t>Стол письменный - 1 шт.; Надставка настольная - 7 шт.; Стол письменный - 12 шт.; Тумба офисная деревянная - 12 шт.; Тумба офисная деревянная - 4 шт.; Подставка под системный блок - 14 шт.; Кресло офисное - 7 шт.; Шкаф для одежды деревянный - 4 шт.; Шкаф для одежды деревянный - 2 шт.; Шкаф деревянный для документов - 1 шт.; Шкаф деревянный для документов - 1 шт.; Шкаф деревянный для документов - 2 шт.; Тумба офисная деревянная - 3 шт.; Стул на металлическом каркасе - 4 шт.; Шкаф для одежды деревянный - 1 шт.</w:t>
+        <w:t>все позиции и количества совпадают</w:t>
         <w:br/>
         <w:br/>
         <w:t>-------------------------</w:t>
@@ -114,39 +142,6 @@
         <w:t>Ошибки:</w:t>
         <w:br/>
         <w:t>- не обнаружены</w:t>
-        <w:br/>
-        <w:br/>
-        <w:t>-------------------------</w:t>
-        <w:br/>
-        <w:t>-------------------------</w:t>
-        <w:br/>
-        <w:br/>
-        <w:t>Проверка товаров и количества в ОМНЦК:</w:t>
-        <w:br/>
-        <w:t>Найдено в Плане-Графике:</w:t>
-        <w:br/>
-        <w:t>Стол письменный - 12 шт.; Стол письменный - 1 шт.; Надставка настольная - 7 шт.; Тумба офисная деревянная - 12 шт.; Тумба офисная деревянная - 4 шт.; Тумба офисная деревянная - 3 шт.; Подставка под системный блок - 14 шт.; Кресло офисное - 7 шт.; Шкаф для одежды деревянный - 4 шт.; Шкаф для одежды деревянный - 2 шт.; Шкаф для одежды деревянный - 1 шт.; Шкаф деревянный для документов - 1 шт.; Шкаф деревянный для документов - 1 шт.; Шкаф деревянный для документов - 2 шт.; Стул на металлическом каркасе - 4 шт.</w:t>
-        <w:br/>
-        <w:br/>
-        <w:t>-------------------------</w:t>
-        <w:br/>
-        <w:br/>
-        <w:t>Найдено в ОМНЦК:</w:t>
-        <w:br/>
-        <w:t>Стол письменный - 1 шт.; Надставка настольная - 7 шт.; Стол письменный - 12 шт.; Тумба офисная деревянная - 12 шт.; Тумба офисная деревянная - 4 шт.; Подставка под системный блок - 14 шт.; Кресло офисное - 7 шт.; Шкаф для одежды деревянный - 4 шт.; Шкаф для одежды деревянный - 2 шт.; Шкаф деревянный для документов - 1 шт.; Шкаф деревянный для документов - 1 шт.; Шкаф деревянный для документов - 2 шт.; Тумба офисная деревянная - 3 шт.; Стул на металлическом каркасе - 4 шт.; Шкаф для одежды деревянный - 1 шт.</w:t>
-        <w:br/>
-        <w:br/>
-        <w:t>-------------------------</w:t>
-        <w:br/>
-        <w:br/>
-        <w:t>Ошибки:</w:t>
-        <w:br/>
-        <w:t>- не обнаружены</w:t>
-        <w:br/>
-        <w:br/>
-        <w:t>-------------------------</w:t>
-        <w:br/>
-        <w:t>-------------------------</w:t>
         <w:br/>
         <w:br/>
         <w:t>---------------------</w:t>
@@ -158,7 +153,7 @@
         <w:br/>
         <w:t>1. [source=Обращение о проведении закупки] Начальная (максимальная) цена контракта: 548 547 рублей 00 копеек</w:t>
         <w:br/>
-        <w:t>2. [source=ОНМЦК] Начальная (максимальная) цена контракта 548 547 рублей 00 копеек определена по минимальному значению вышеуказанных данных.</w:t>
+        <w:t>2. [source=ОНМЦК] Начальная (максимальная) цена контракта 548 547 рублей 00 копеек</w:t>
         <w:br/>
         <w:t>3. [source=Пояснительная записка] ОНМЦК: 548 547 рублей 00 копеек</w:t>
         <w:br/>
@@ -184,10 +179,6 @@
         <w:t>3. [source=Пояснительная записка] Срок поставки: в течение 45 (сорока пяти) календарных дней с даты заключения Контракта.</w:t>
         <w:br/>
         <w:t>4. [source=Контракт] Срок поставки: в течение 45 календарных дней с даты заключения контракта.</w:t>
-        <w:br/>
-        <w:t>5. [source=Пояснительная записка] Срок поставки: в течение 45 (сорока пяти) календарных дней с даты заключения Контракта.</w:t>
-        <w:br/>
-        <w:t>6. [source=Контракт] в срок в течение 45 (сорока пяти) календарных</w:t>
         <w:br/>
         <w:br/>
         <w:t>Ошибки:</w:t>

</xml_diff>